<commit_message>
Add Quartz v5 publishing features
</commit_message>
<xml_diff>
--- a/docs/huong-dan-su-dung-tung-blog.docx
+++ b/docs/huong-dan-su-dung-tung-blog.docx
@@ -2187,6 +2187,25 @@
       </w:r>
     </w:p>
     <w:p>
+      <w:pPr/>
+      <w:r>
+        <w:t>Mỗi ghi chú muốn xuất hiện trên web phải có frontmatter publish: true. Ghi chú không có thuộc tính này vẫn được giữ riêng trong vault.</w:t>
+      </w:r>
+    </w:p>
+    <w:p>
+      <w:pPr/>
+      <w:r>
+        <w:rPr>
+          <w:rFonts w:ascii="Consolas" w:hAnsi="Consolas"/>
+        </w:rPr>
+        <w:t>---</w:t>
+        <w:br/>
+        <w:t>publish: true</w:t>
+        <w:br/>
+        <w:t>---</w:t>
+      </w:r>
+    </w:p>
+    <w:p>
       <w:pPr>
         <w:pStyle w:val="ListNumber"/>
       </w:pPr>
@@ -2199,7 +2218,7 @@
         <w:pStyle w:val="ListNumber"/>
       </w:pPr>
       <w:r>
-        <w:t>Chạy pnpm brain:sync để sao chép phần được phép public.</w:t>
+        <w:t>Chạy pnpm brain:sync để sao chép vault và tạo trang chủ Second Brain.</w:t>
       </w:r>
     </w:p>
     <w:p>
@@ -2224,6 +2243,46 @@
       </w:pPr>
       <w:r>
         <w:t>Nhấn Ctrl + C để dừng server, sau đó build và push.</w:t>
+      </w:r>
+    </w:p>
+    <w:p>
+      <w:pPr>
+        <w:pStyle w:val="Heading2"/>
+      </w:pPr>
+      <w:r>
+        <w:t>Tính năng Quartz v5 đang bật</w:t>
+      </w:r>
+    </w:p>
+    <w:p>
+      <w:pPr>
+        <w:pStyle w:val="ListBullet"/>
+      </w:pPr>
+      <w:r>
+        <w:t>Ghi chú gần đây: hiện 5 ghi chú cập nhật gần nhất ở cuối trang.</w:t>
+      </w:r>
+    </w:p>
+    <w:p>
+      <w:pPr>
+        <w:pStyle w:val="ListBullet"/>
+      </w:pPr>
+      <w:r>
+        <w:t>Ảnh chia sẻ động: tự tạo ảnh Open Graph 1200 x 630 cho từng trang.</w:t>
+      </w:r>
+    </w:p>
+    <w:p>
+      <w:pPr>
+        <w:pStyle w:val="ListBullet"/>
+      </w:pPr>
+      <w:r>
+        <w:t>Explicit Publish: chỉ xuất bản ghi chú có publish: true.</w:t>
+      </w:r>
+    </w:p>
+    <w:p>
+      <w:pPr>
+        <w:pStyle w:val="ListBullet"/>
+      </w:pPr>
+      <w:r>
+        <w:t>Canvas Page: chỉ file .canvas trong thư mục public-canvas được đưa lên web, dưới dạng sơ đồ có thể kéo và thu phóng.</w:t>
       </w:r>
     </w:p>
     <w:tbl>
@@ -2364,6 +2423,14 @@
       </w:pPr>
       <w:r>
         <w:t>file .base</w:t>
+      </w:r>
+    </w:p>
+    <w:p>
+      <w:pPr>
+        <w:pStyle w:val="ListBullet"/>
+      </w:pPr>
+      <w:r>
+        <w:t>ghi chú không có publish: true</w:t>
       </w:r>
     </w:p>
     <w:p>
@@ -3142,6 +3209,12 @@
       </w:r>
     </w:p>
     <w:p>
+      <w:pPr/>
+      <w:r>
+        <w:t>Backup vault trước khi bật Explicit Publish: LEED_Obsidian_Vault-backup-before-quartz-v5-plugins-2026-07-02.zip trong Downloads.</w:t>
+      </w:r>
+    </w:p>
+    <w:p>
       <w:pPr>
         <w:pStyle w:val="Heading1"/>
       </w:pPr>

</xml_diff>